<commit_message>
lost HW design spec???
</commit_message>
<xml_diff>
--- a/_3 Develop/_Design Spec/LabVIEW App Spec/DS MLOI LabVIEW App Specification.docx
+++ b/_3 Develop/_Design Spec/LabVIEW App Spec/DS MLOI LabVIEW App Specification.docx
@@ -224,7 +224,6 @@
         <w:tc>
           <w:tcPr>
             <w:tcW w:w="1278" w:type="dxa"/>
-            <w:shd w:val="clear" w:color="auto" w:fill="auto"/>
             <w:tcMar>
               <w:top w:w="0" w:type="dxa"/>
               <w:left w:w="0" w:type="dxa"/>
@@ -251,7 +250,6 @@
         <w:tc>
           <w:tcPr>
             <w:tcW w:w="6570" w:type="dxa"/>
-            <w:shd w:val="clear" w:color="auto" w:fill="auto"/>
             <w:tcMar>
               <w:top w:w="0" w:type="dxa"/>
               <w:left w:w="0" w:type="dxa"/>
@@ -278,7 +276,6 @@
         <w:tc>
           <w:tcPr>
             <w:tcW w:w="1727" w:type="dxa"/>
-            <w:shd w:val="clear" w:color="auto" w:fill="auto"/>
             <w:tcMar>
               <w:top w:w="0" w:type="dxa"/>
               <w:left w:w="0" w:type="dxa"/>
@@ -307,7 +304,6 @@
         <w:tc>
           <w:tcPr>
             <w:tcW w:w="1278" w:type="dxa"/>
-            <w:shd w:val="clear" w:color="auto" w:fill="auto"/>
             <w:tcMar>
               <w:top w:w="0" w:type="dxa"/>
               <w:left w:w="0" w:type="dxa"/>
@@ -331,7 +327,6 @@
         <w:tc>
           <w:tcPr>
             <w:tcW w:w="6570" w:type="dxa"/>
-            <w:shd w:val="clear" w:color="auto" w:fill="auto"/>
             <w:tcMar>
               <w:top w:w="0" w:type="dxa"/>
               <w:left w:w="0" w:type="dxa"/>
@@ -355,7 +350,6 @@
         <w:tc>
           <w:tcPr>
             <w:tcW w:w="1727" w:type="dxa"/>
-            <w:shd w:val="clear" w:color="auto" w:fill="auto"/>
             <w:tcMar>
               <w:top w:w="0" w:type="dxa"/>
               <w:left w:w="0" w:type="dxa"/>
@@ -381,7 +375,6 @@
         <w:tc>
           <w:tcPr>
             <w:tcW w:w="1278" w:type="dxa"/>
-            <w:shd w:val="clear" w:color="auto" w:fill="auto"/>
             <w:tcMar>
               <w:top w:w="0" w:type="dxa"/>
               <w:left w:w="0" w:type="dxa"/>
@@ -405,7 +398,6 @@
         <w:tc>
           <w:tcPr>
             <w:tcW w:w="6570" w:type="dxa"/>
-            <w:shd w:val="clear" w:color="auto" w:fill="auto"/>
             <w:tcMar>
               <w:top w:w="0" w:type="dxa"/>
               <w:left w:w="0" w:type="dxa"/>
@@ -429,7 +421,6 @@
         <w:tc>
           <w:tcPr>
             <w:tcW w:w="1727" w:type="dxa"/>
-            <w:shd w:val="clear" w:color="auto" w:fill="auto"/>
             <w:tcMar>
               <w:top w:w="0" w:type="dxa"/>
               <w:left w:w="0" w:type="dxa"/>
@@ -457,7 +448,6 @@
         <w:tc>
           <w:tcPr>
             <w:tcW w:w="1278" w:type="dxa"/>
-            <w:shd w:val="clear" w:color="auto" w:fill="auto"/>
             <w:tcMar>
               <w:top w:w="0" w:type="dxa"/>
               <w:left w:w="0" w:type="dxa"/>
@@ -481,7 +471,6 @@
         <w:tc>
           <w:tcPr>
             <w:tcW w:w="6570" w:type="dxa"/>
-            <w:shd w:val="clear" w:color="auto" w:fill="auto"/>
             <w:tcMar>
               <w:top w:w="0" w:type="dxa"/>
               <w:left w:w="0" w:type="dxa"/>
@@ -505,7 +494,6 @@
         <w:tc>
           <w:tcPr>
             <w:tcW w:w="1727" w:type="dxa"/>
-            <w:shd w:val="clear" w:color="auto" w:fill="auto"/>
             <w:tcMar>
               <w:top w:w="0" w:type="dxa"/>
               <w:left w:w="0" w:type="dxa"/>
@@ -531,7 +519,6 @@
         <w:tc>
           <w:tcPr>
             <w:tcW w:w="1278" w:type="dxa"/>
-            <w:shd w:val="clear" w:color="auto" w:fill="auto"/>
             <w:tcMar>
               <w:top w:w="0" w:type="dxa"/>
               <w:left w:w="0" w:type="dxa"/>
@@ -555,7 +542,6 @@
         <w:tc>
           <w:tcPr>
             <w:tcW w:w="6570" w:type="dxa"/>
-            <w:shd w:val="clear" w:color="auto" w:fill="auto"/>
             <w:tcMar>
               <w:top w:w="0" w:type="dxa"/>
               <w:left w:w="0" w:type="dxa"/>
@@ -579,7 +565,6 @@
         <w:tc>
           <w:tcPr>
             <w:tcW w:w="1727" w:type="dxa"/>
-            <w:shd w:val="clear" w:color="auto" w:fill="auto"/>
             <w:tcMar>
               <w:top w:w="0" w:type="dxa"/>
               <w:left w:w="0" w:type="dxa"/>
@@ -664,6 +649,7 @@
           <w:docPartUnique/>
         </w:docPartObj>
       </w:sdtPr>
+      <w:sdtEndPr/>
       <w:sdtContent>
         <w:p>
           <w:pPr>
@@ -3908,7 +3894,6 @@
         <w:tc>
           <w:tcPr>
             <w:tcW w:w="1620" w:type="dxa"/>
-            <w:shd w:val="clear" w:color="auto" w:fill="auto"/>
             <w:tcMar>
               <w:top w:w="0" w:type="dxa"/>
               <w:left w:w="0" w:type="dxa"/>
@@ -3936,7 +3921,6 @@
         <w:tc>
           <w:tcPr>
             <w:tcW w:w="5715" w:type="dxa"/>
-            <w:shd w:val="clear" w:color="auto" w:fill="auto"/>
             <w:tcMar>
               <w:top w:w="0" w:type="dxa"/>
               <w:left w:w="0" w:type="dxa"/>
@@ -3963,7 +3947,6 @@
         <w:tc>
           <w:tcPr>
             <w:tcW w:w="2025" w:type="dxa"/>
-            <w:shd w:val="clear" w:color="auto" w:fill="auto"/>
             <w:tcMar>
               <w:top w:w="0" w:type="dxa"/>
               <w:left w:w="0" w:type="dxa"/>
@@ -3993,7 +3976,6 @@
         <w:tc>
           <w:tcPr>
             <w:tcW w:w="1620" w:type="dxa"/>
-            <w:shd w:val="clear" w:color="auto" w:fill="auto"/>
             <w:tcMar>
               <w:top w:w="0" w:type="dxa"/>
               <w:left w:w="0" w:type="dxa"/>
@@ -4021,7 +4003,6 @@
         <w:tc>
           <w:tcPr>
             <w:tcW w:w="5715" w:type="dxa"/>
-            <w:shd w:val="clear" w:color="auto" w:fill="auto"/>
             <w:tcMar>
               <w:top w:w="0" w:type="dxa"/>
               <w:left w:w="0" w:type="dxa"/>
@@ -4056,7 +4037,6 @@
         <w:tc>
           <w:tcPr>
             <w:tcW w:w="2025" w:type="dxa"/>
-            <w:shd w:val="clear" w:color="auto" w:fill="auto"/>
             <w:tcMar>
               <w:top w:w="0" w:type="dxa"/>
               <w:left w:w="0" w:type="dxa"/>
@@ -4086,7 +4066,6 @@
         <w:tc>
           <w:tcPr>
             <w:tcW w:w="1620" w:type="dxa"/>
-            <w:shd w:val="clear" w:color="auto" w:fill="auto"/>
             <w:tcMar>
               <w:top w:w="0" w:type="dxa"/>
               <w:left w:w="0" w:type="dxa"/>
@@ -4115,7 +4094,6 @@
         <w:tc>
           <w:tcPr>
             <w:tcW w:w="5715" w:type="dxa"/>
-            <w:shd w:val="clear" w:color="auto" w:fill="auto"/>
             <w:tcMar>
               <w:top w:w="0" w:type="dxa"/>
               <w:left w:w="0" w:type="dxa"/>
@@ -4142,7 +4120,6 @@
         <w:tc>
           <w:tcPr>
             <w:tcW w:w="2025" w:type="dxa"/>
-            <w:shd w:val="clear" w:color="auto" w:fill="auto"/>
             <w:tcMar>
               <w:top w:w="0" w:type="dxa"/>
               <w:left w:w="0" w:type="dxa"/>
@@ -5170,6 +5147,9 @@
     <w:p/>
     <w:p>
       <w:r>
+        <w:rPr>
+          <w:noProof/>
+        </w:rPr>
         <w:drawing>
           <wp:inline distT="0" distB="0" distL="0" distR="0" wp14:anchorId="3188FF9F" wp14:editId="5A9B74B0">
             <wp:extent cx="5943600" cy="2584450"/>
@@ -6660,15 +6640,7 @@
       <w:proofErr w:type="spellEnd"/>
       <w:proofErr w:type="gramEnd"/>
       <w:r>
-        <w:t xml:space="preserve"> </w:t>
-      </w:r>
-      <w:proofErr w:type="gramStart"/>
-      <w:r>
-        <w:t>Destination</w:t>
-      </w:r>
-      <w:proofErr w:type="gramEnd"/>
-      <w:r>
-        <w:t xml:space="preserve"> Folder.</w:t>
+        <w:t xml:space="preserve"> Destination Folder.</w:t>
       </w:r>
     </w:p>
     <w:p>
@@ -7319,15 +7291,7 @@
         <w:t>.</w:t>
       </w:r>
       <w:r>
-        <w:t xml:space="preserve"> Click on </w:t>
-      </w:r>
-      <w:proofErr w:type="gramStart"/>
-      <w:r>
-        <w:t>Code</w:t>
-      </w:r>
-      <w:proofErr w:type="gramEnd"/>
-      <w:r>
-        <w:t xml:space="preserve"> button.</w:t>
+        <w:t xml:space="preserve"> Click on Code button.</w:t>
       </w:r>
     </w:p>
     <w:p>
@@ -8667,19 +8631,15 @@
       <w:r>
         <w:t xml:space="preserve">Starting </w:t>
       </w:r>
-      <w:proofErr w:type="spellStart"/>
-      <w:r>
-        <w:t>fron</w:t>
-      </w:r>
-      <w:proofErr w:type="spellEnd"/>
+      <w:r>
+        <w:t>from</w:t>
+      </w:r>
       <w:r>
         <w:t xml:space="preserve"> an </w:t>
       </w:r>
-      <w:proofErr w:type="spellStart"/>
-      <w:r>
-        <w:t>exixting</w:t>
-      </w:r>
-      <w:proofErr w:type="spellEnd"/>
+      <w:r>
+        <w:t>existing</w:t>
+      </w:r>
       <w:r>
         <w:t xml:space="preserve"> branch</w:t>
       </w:r>

</xml_diff>